<commit_message>
passed AWS developer associate, adding to resume
</commit_message>
<xml_diff>
--- a/docs/David_Whiteside_Resume_Public.docx
+++ b/docs/David_Whiteside_Resume_Public.docx
@@ -1060,25 +1060,6 @@
           <w:tab w:val="right" w:leader="none" w:pos="9360"/>
         </w:tabs>
         <w:spacing w:after="40" w:before="180" w:lineRule="auto"/>
-        <w:rPr>
-          <w:b w:val="1"/>
-          <w:bCs w:val="1"/>
-          <w:sz w:val="22"/>
-          <w:szCs w:val="22"/>
-        </w:rPr>
-      </w:pPr>
-      <w:r>
-        <w:rPr>
-          <w:rtl w:val="0"/>
-        </w:rPr>
-      </w:r>
-    </w:p>
-    <w:p>
-      <w:pPr>
-        <w:tabs>
-          <w:tab w:val="right" w:leader="none" w:pos="9360"/>
-        </w:tabs>
-        <w:spacing w:after="40" w:before="180" w:lineRule="auto"/>
         <w:rPr/>
       </w:pPr>
       <w:r>
@@ -1550,70 +1531,45 @@
       </w:pPr>
       <w:r>
         <w:rPr>
-          <w:rFonts w:ascii="Arial" w:cs="Arial" w:eastAsia="Arial" w:hAnsi="Arial"/>
-          <w:color w:val="1f2937"/>
-          <w:sz w:val="20"/>
-          <w:szCs w:val="20"/>
-          <w:rtl w:val="0"/>
-        </w:rPr>
-        <w:t xml:space="preserve">AWS Certified SysOps Administrator – Associate</w:t>
-      </w:r>
-      <w:r>
-        <w:rPr>
-          <w:rFonts w:ascii="Arial" w:cs="Arial" w:eastAsia="Arial" w:hAnsi="Arial"/>
+          <w:rtl w:val="0"/>
+        </w:rPr>
+        <w:t xml:space="preserve">AWS Certified SysOps Administrator - Associate</w:t>
+      </w:r>
+      <w:r>
+        <w:rPr>
           <w:color w:val="6b7280"/>
-          <w:sz w:val="20"/>
-          <w:szCs w:val="20"/>
           <w:rtl w:val="0"/>
         </w:rPr>
         <w:t xml:space="preserve"> │ </w:t>
       </w:r>
       <w:r>
         <w:rPr>
-          <w:rFonts w:ascii="Arial" w:cs="Arial" w:eastAsia="Arial" w:hAnsi="Arial"/>
-          <w:color w:val="1f2937"/>
-          <w:sz w:val="20"/>
-          <w:szCs w:val="20"/>
-          <w:rtl w:val="0"/>
-        </w:rPr>
-        <w:t xml:space="preserve">AWS Certified Solutions Architect – Associate</w:t>
-      </w:r>
-      <w:r>
-        <w:rPr>
-          <w:rFonts w:ascii="Arial" w:cs="Arial" w:eastAsia="Arial" w:hAnsi="Arial"/>
+          <w:rtl w:val="0"/>
+        </w:rPr>
+        <w:t xml:space="preserve">AWS Certified Solutions Architect - Associate</w:t>
+      </w:r>
+      <w:r>
+        <w:rPr>
           <w:color w:val="6b7280"/>
-          <w:sz w:val="20"/>
-          <w:szCs w:val="20"/>
           <w:rtl w:val="0"/>
         </w:rPr>
         <w:t xml:space="preserve"> │ </w:t>
       </w:r>
       <w:r>
         <w:rPr>
-          <w:rFonts w:ascii="Arial" w:cs="Arial" w:eastAsia="Arial" w:hAnsi="Arial"/>
-          <w:color w:val="1f2937"/>
-          <w:sz w:val="20"/>
-          <w:szCs w:val="20"/>
-          <w:rtl w:val="0"/>
-        </w:rPr>
-        <w:t xml:space="preserve">AWS Certified AI Practitioner</w:t>
-      </w:r>
-      <w:r>
-        <w:rPr>
-          <w:rFonts w:ascii="Arial" w:cs="Arial" w:eastAsia="Arial" w:hAnsi="Arial"/>
+          <w:rtl w:val="0"/>
+        </w:rPr>
+        <w:t xml:space="preserve">AWS Certified Developer - Associate | AWS Certified AI Practitioner</w:t>
+      </w:r>
+      <w:r>
+        <w:rPr>
           <w:color w:val="6b7280"/>
-          <w:sz w:val="20"/>
-          <w:szCs w:val="20"/>
           <w:rtl w:val="0"/>
         </w:rPr>
         <w:t xml:space="preserve"> │ </w:t>
       </w:r>
       <w:r>
         <w:rPr>
-          <w:rFonts w:ascii="Arial" w:cs="Arial" w:eastAsia="Arial" w:hAnsi="Arial"/>
-          <w:color w:val="1f2937"/>
-          <w:sz w:val="20"/>
-          <w:szCs w:val="20"/>
           <w:rtl w:val="0"/>
         </w:rPr>
         <w:t xml:space="preserve">AWS Certified Cloud Practitioner</w:t>

</xml_diff>

<commit_message>
update resume public site
</commit_message>
<xml_diff>
--- a/docs/David_Whiteside_Resume_Public.docx
+++ b/docs/David_Whiteside_Resume_Public.docx
@@ -1572,7 +1572,7 @@
         <w:rPr>
           <w:rtl w:val="0"/>
         </w:rPr>
-        <w:t xml:space="preserve">AWS Certified Cloud Practitioner | Hashicorp Terraform Associate</w:t>
+        <w:t xml:space="preserve">AWS Certified Cloud Practitioner</w:t>
       </w:r>
       <w:r>
         <w:rPr>
@@ -1613,9 +1613,13 @@
       </w:pPr>
       <w:r>
         <w:rPr>
-          <w:rtl w:val="0"/>
-        </w:rPr>
-        <w:t xml:space="preserve">I'm an active contributor on GitHub (github.com/thedavidwhiteside) with contributions to Ansible, Paramiko, NHC, and Torque, and the maintainer of ansible-docgen and tempyenv.</w:t>
+          <w:rFonts w:ascii="Arial" w:cs="Arial" w:eastAsia="Arial" w:hAnsi="Arial"/>
+          <w:color w:val="1f2937"/>
+          <w:sz w:val="20"/>
+          <w:szCs w:val="20"/>
+          <w:rtl w:val="0"/>
+        </w:rPr>
+        <w:t xml:space="preserve">Active contributor on GitHub (github.com/thedavidwhiteside). Contributions to Ansible, Paramiko, Torque, NHC, tempyenv, and ansible-docgen.</w:t>
       </w:r>
       <w:r>
         <w:rPr>

</xml_diff>